<commit_message>
docs: revise invention tools specification and tickets
</commit_message>
<xml_diff>
--- a/.scratch/ai-inventions/spec.docx
+++ b/.scratch/ai-inventions/spec.docx
@@ -4,229 +4,42 @@
   <w:body>
     <w:p>
       <w:pPr>
-        <w:spacing w:after="40"/>
-      </w:pPr>
-      <w:r>
-        <w:rPr>
-          <w:b/>
-          <w:color w:val="2E74B5"/>
-          <w:sz w:val="24"/>
-        </w:rPr>
-        <w:t>Мини-ТЗ</w:t>
-      </w:r>
-    </w:p>
-    <w:p>
-      <w:pPr>
-        <w:spacing w:after="80"/>
+        <w:spacing w:after="100"/>
       </w:pPr>
       <w:r>
         <w:rPr>
           <w:b/>
           <w:color w:val="0B2545"/>
-          <w:sz w:val="54"/>
+          <w:sz w:val="52"/>
         </w:rPr>
-        <w:t>«ИИ для изобретений»</w:t>
+        <w:t>Мини-ТЗ: «Инструменты для изобретений»</w:t>
       </w:r>
     </w:p>
     <w:p>
-      <w:pPr>
-        <w:spacing w:after="240"/>
-      </w:pPr>
+      <w:r>
+        <w:t xml:space="preserve">Статус: </w:t>
+      </w:r>
       <w:r>
         <w:rPr>
-          <w:i/>
-          <w:color w:val="5A6978"/>
+          <w:b/>
         </w:rPr>
-        <w:t>Расширение научного агента: новый раздел, нишевой поиск и три Telegram-дайджеста</w:t>
+        <w:t>на согласовании клиентом</w:t>
+      </w:r>
+      <w:r>
+        <w:t xml:space="preserve">  </w:t>
       </w:r>
     </w:p>
-    <w:tbl>
-      <w:tblPr>
-        <w:tblW w:type="auto" w:w="0"/>
-        <w:jc w:val="left"/>
-        <w:tblLayout w:type="fixed"/>
-        <w:tblLook w:firstColumn="1" w:firstRow="1" w:lastColumn="0" w:lastRow="0" w:noHBand="0" w:noVBand="1" w:val="04A0"/>
-      </w:tblPr>
-      <w:tblGrid>
-        <w:gridCol w:w="3264"/>
-        <w:gridCol w:w="3264"/>
-        <w:gridCol w:w="3264"/>
-      </w:tblGrid>
-      <w:tr>
-        <w:tc>
-          <w:tcPr>
-            <w:tcW w:type="dxa" w:w="3264"/>
-            <w:shd w:fill="F2F5F8"/>
-            <w:tcMar>
-              <w:top w:w="100" w:type="dxa"/>
-              <w:start w:w="140" w:type="dxa"/>
-              <w:bottom w:w="100" w:type="dxa"/>
-              <w:end w:w="140" w:type="dxa"/>
-            </w:tcMar>
-          </w:tcPr>
-          <w:p>
-            <w:pPr>
-              <w:spacing w:after="40"/>
-            </w:pPr>
-            <w:r>
-              <w:rPr>
-                <w:b/>
-                <w:color w:val="5A6978"/>
-                <w:sz w:val="16"/>
-              </w:rPr>
-              <w:t>СТАТУС</w:t>
-            </w:r>
-          </w:p>
-          <w:p>
-            <w:pPr>
-              <w:spacing w:after="0"/>
-            </w:pPr>
-            <w:r>
-              <w:rPr>
-                <w:b/>
-                <w:color w:val="0B2545"/>
-              </w:rPr>
-              <w:t>На согласовании клиентом</w:t>
-            </w:r>
-          </w:p>
-        </w:tc>
-        <w:tc>
-          <w:tcPr>
-            <w:tcW w:type="dxa" w:w="3264"/>
-            <w:shd w:fill="F2F5F8"/>
-            <w:tcMar>
-              <w:top w:w="100" w:type="dxa"/>
-              <w:start w:w="140" w:type="dxa"/>
-              <w:bottom w:w="100" w:type="dxa"/>
-              <w:end w:w="140" w:type="dxa"/>
-            </w:tcMar>
-          </w:tcPr>
-          <w:p>
-            <w:pPr>
-              <w:spacing w:after="40"/>
-            </w:pPr>
-            <w:r>
-              <w:rPr>
-                <w:b/>
-                <w:color w:val="5A6978"/>
-                <w:sz w:val="16"/>
-              </w:rPr>
-              <w:t>ДАТА</w:t>
-            </w:r>
-          </w:p>
-          <w:p>
-            <w:pPr>
-              <w:spacing w:after="0"/>
-            </w:pPr>
-            <w:r>
-              <w:rPr>
-                <w:b/>
-                <w:color w:val="0B2545"/>
-              </w:rPr>
-              <w:t>13 августа 2026 г.</w:t>
-            </w:r>
-          </w:p>
-        </w:tc>
-        <w:tc>
-          <w:tcPr>
-            <w:tcW w:type="dxa" w:w="3264"/>
-            <w:shd w:fill="F2F5F8"/>
-            <w:tcMar>
-              <w:top w:w="100" w:type="dxa"/>
-              <w:start w:w="140" w:type="dxa"/>
-              <w:bottom w:w="100" w:type="dxa"/>
-              <w:end w:w="140" w:type="dxa"/>
-            </w:tcMar>
-          </w:tcPr>
-          <w:p>
-            <w:pPr>
-              <w:spacing w:after="40"/>
-            </w:pPr>
-            <w:r>
-              <w:rPr>
-                <w:b/>
-                <w:color w:val="5A6978"/>
-                <w:sz w:val="16"/>
-              </w:rPr>
-              <w:t>ОЦЕНКА</w:t>
-            </w:r>
-          </w:p>
-          <w:p>
-            <w:pPr>
-              <w:spacing w:after="0"/>
-            </w:pPr>
-            <w:r>
-              <w:rPr>
-                <w:b/>
-                <w:color w:val="0B2545"/>
-              </w:rPr>
-              <w:t>12 000–16 000 ₽</w:t>
-            </w:r>
-          </w:p>
-        </w:tc>
-      </w:tr>
-    </w:tbl>
-    <w:p/>
-    <w:tbl>
-      <w:tblPr>
-        <w:tblW w:type="auto" w:w="0"/>
-        <w:jc w:val="center"/>
-        <w:tblLook w:firstColumn="1" w:firstRow="1" w:lastColumn="0" w:lastRow="0" w:noHBand="0" w:noVBand="1" w:val="04A0"/>
-      </w:tblPr>
-      <w:tblGrid>
-        <w:gridCol w:w="9792"/>
-      </w:tblGrid>
-      <w:tr>
-        <w:tc>
-          <w:tcPr>
-            <w:tcW w:type="dxa" w:w="9792"/>
-            <w:shd w:fill="EAF3F8"/>
-            <w:tcMar>
-              <w:top w:w="100" w:type="dxa"/>
-              <w:start w:w="140" w:type="dxa"/>
-              <w:bottom w:w="100" w:type="dxa"/>
-              <w:end w:w="140" w:type="dxa"/>
-            </w:tcMar>
-          </w:tcPr>
-          <w:p>
-            <w:pPr>
-              <w:spacing w:after="0"/>
-            </w:pPr>
-            <w:r>
-              <w:rPr>
-                <w:b/>
-                <w:color w:val="1F4D78"/>
-              </w:rPr>
-              <w:t xml:space="preserve">РЕШЕНИЕ ДЛЯ СОГЛАСОВАНИЯ  </w:t>
-            </w:r>
-            <w:r>
-              <w:t>Добавить третий раздел «ИИ для изобретений» и перейти к схеме «оркестратор + три нишевых субагента», сохранив текущую обработку YouTube, дедупликацию и публикацию.</w:t>
-            </w:r>
-          </w:p>
-        </w:tc>
-      </w:tr>
-    </w:tbl>
     <w:p>
-      <w:pPr>
-        <w:spacing w:after="0"/>
-      </w:pPr>
+      <w:r>
+        <w:t>Дата обновления: 14 августа 2026 г.</w:t>
+      </w:r>
     </w:p>
     <w:p>
       <w:pPr>
         <w:pStyle w:val="Heading1"/>
       </w:pPr>
       <w:r>
-        <w:t>1. Цель</w:t>
-      </w:r>
-    </w:p>
-    <w:p>
-      <w:r>
-        <w:t>Добавить третий тематический раздел — «ИИ для изобретений» — для материалов о системах, агентах и инструментах, которые помогают создавать, синтезировать, проектировать, моделировать или проверять новые вещества, материалы, лекарства, устройства и технологические решения.</w:t>
-      </w:r>
-    </w:p>
-    <w:p>
-      <w:r>
-        <w:t>Новая структура агента:</w:t>
+        <w:t>1. Три раздела</w:t>
       </w:r>
     </w:p>
     <w:p>
@@ -235,7 +48,18 @@
         <w:spacing w:after="60"/>
       </w:pPr>
       <w:r>
-        <w:t>ИИ-инструменты</w:t>
+        <w:rPr>
+          <w:b/>
+        </w:rPr>
+        <w:t>ИИ-новости</w:t>
+      </w:r>
+      <w:r>
+        <w:t xml:space="preserve"> — любые новости об ИИ: модели, продукты, компании,</w:t>
+      </w:r>
+    </w:p>
+    <w:p>
+      <w:r>
+        <w:t xml:space="preserve">   исследования, релизы, обновления и разработки.</w:t>
       </w:r>
     </w:p>
     <w:p>
@@ -244,7 +68,18 @@
         <w:spacing w:after="60"/>
       </w:pPr>
       <w:r>
+        <w:rPr>
+          <w:b/>
+        </w:rPr>
         <w:t>ИИ для науки</w:t>
+      </w:r>
+      <w:r>
+        <w:t xml:space="preserve"> — инструменты и новости для научных исследований, поиска</w:t>
+      </w:r>
+    </w:p>
+    <w:p>
+      <w:r>
+        <w:t xml:space="preserve">   литературы, анализа данных и планирования экспериментов.</w:t>
       </w:r>
     </w:p>
     <w:p>
@@ -253,7 +88,38 @@
         <w:spacing w:after="60"/>
       </w:pPr>
       <w:r>
-        <w:t>ИИ для изобретений</w:t>
+        <w:rPr>
+          <w:b/>
+        </w:rPr>
+        <w:t>Инструменты для изобретений</w:t>
+      </w:r>
+      <w:r>
+        <w:t xml:space="preserve"> — ИИ-инструменты, агенты и методы, которые</w:t>
+      </w:r>
+    </w:p>
+    <w:p>
+      <w:r>
+        <w:t xml:space="preserve">   помогают расшифровывать неизвестное, создавать, синтезировать, прогнозировать,</w:t>
+      </w:r>
+    </w:p>
+    <w:p>
+      <w:r>
+        <w:t xml:space="preserve">   проектировать или проверять новые вещества, материалы, лекарства, устройства</w:t>
+      </w:r>
+    </w:p>
+    <w:p>
+      <w:r>
+        <w:t xml:space="preserve">   и технологические решения.</w:t>
+      </w:r>
+    </w:p>
+    <w:p>
+      <w:r>
+        <w:t>Названия и порядок разделов совпадают на десктопе, мобильной версии и в</w:t>
+      </w:r>
+    </w:p>
+    <w:p>
+      <w:r>
+        <w:t>Telegram. В мобильной версии допустимы короткие подписи без изменения смысла.</w:t>
       </w:r>
     </w:p>
     <w:p>
@@ -261,7 +127,7 @@
         <w:pStyle w:val="Heading1"/>
       </w:pPr>
       <w:r>
-        <w:t>2. Что входит в MVP</w:t>
+        <w:t>2. Архитектура MVP</w:t>
       </w:r>
     </w:p>
     <w:p>
@@ -270,7 +136,12 @@
         <w:spacing w:after="60"/>
       </w:pPr>
       <w:r>
-        <w:t>Оркестратор Hermes и три нишевых субагента: ИИ-инструменты, ИИ для науки, ИИ для изобретений.</w:t>
+        <w:t>Hermes-оркестратор координирует общий поток и три нишевых субагента:</w:t>
+      </w:r>
+    </w:p>
+    <w:p>
+      <w:r>
+        <w:t xml:space="preserve">  ИИ-новости, ИИ для науки, Инструменты для изобретений.</w:t>
       </w:r>
     </w:p>
     <w:p>
@@ -279,7 +150,12 @@
         <w:spacing w:after="60"/>
       </w:pPr>
       <w:r>
-        <w:t>Каждый субагент получает общий поток материалов и дополнительно ищет в собственном наборе источников.</w:t>
+        <w:t>Каждый субагент получает общий поток и дополнительно ищет материалы в своём</w:t>
+      </w:r>
+    </w:p>
+    <w:p>
+      <w:r>
+        <w:t xml:space="preserve">  наборе источников.</w:t>
       </w:r>
     </w:p>
     <w:p>
@@ -288,7 +164,27 @@
         <w:spacing w:after="60"/>
       </w:pPr>
       <w:r>
-        <w:t>Новый раздел в дашборде, фильтр и счётчики.</w:t>
+        <w:t>ScrapeGraphAI (</w:t>
+      </w:r>
+      <w:r>
+        <w:rPr>
+          <w:rFonts w:ascii="Aptos Mono" w:hAnsi="Aptos Mono"/>
+          <w:sz w:val="19"/>
+        </w:rPr>
+        <w:t>Scrapegraph-ai</w:t>
+      </w:r>
+      <w:r>
+        <w:t>) подключается как fallback для поиска и</w:t>
+      </w:r>
+    </w:p>
+    <w:p>
+      <w:r>
+        <w:t xml:space="preserve">  извлечения страниц без стабильного RSS/API. Основными каналами остаются</w:t>
+      </w:r>
+    </w:p>
+    <w:p>
+      <w:r>
+        <w:t xml:space="preserve">  проверенные RSS/API; fallback не заменяет SSRF-защиту и дедупликацию.</w:t>
       </w:r>
     </w:p>
     <w:p>
@@ -297,7 +193,7 @@
         <w:spacing w:after="60"/>
       </w:pPr>
       <w:r>
-        <w:t>Автоматическое определение принадлежности материала к разделу.</w:t>
+        <w:t>В дашборде появляются третий раздел, фильтр и счётчики.</w:t>
       </w:r>
     </w:p>
     <w:p>
@@ -306,7 +202,38 @@
         <w:spacing w:after="60"/>
       </w:pPr>
       <w:r>
-        <w:t>Несколько тегов сфер у одной карточки.</w:t>
+        <w:t>Telegram отправляет три отдельных сообщения с теми же названиями.</w:t>
+      </w:r>
+    </w:p>
+    <w:p>
+      <w:pPr>
+        <w:pStyle w:val="Heading1"/>
+      </w:pPr>
+      <w:r>
+        <w:t>3. Обязательные постоянные карточки</w:t>
+      </w:r>
+    </w:p>
+    <w:p>
+      <w:r>
+        <w:t>Следующие инструменты добавляются в дашборд как постоянные карточки с</w:t>
+      </w:r>
+    </w:p>
+    <w:p>
+      <w:r>
+        <w:t>описанием и официальными ссылками. Список одновременно задаёт обязательный</w:t>
+      </w:r>
+    </w:p>
+    <w:p>
+      <w:r>
+        <w:t>набор объектов и направления, по которым субагент должен искать новости.</w:t>
+      </w:r>
+    </w:p>
+    <w:p>
+      <w:pPr>
+        <w:pStyle w:val="Heading2"/>
+      </w:pPr>
+      <w:r>
+        <w:t>Новые материалы</w:t>
       </w:r>
     </w:p>
     <w:p>
@@ -315,7 +242,13 @@
         <w:spacing w:after="60"/>
       </w:pPr>
       <w:r>
-        <w:t>Базовые сферы: химия, материалы, биология, медицина, фармацевтика, инженерия, энергетика, робототехника, климат/экология, промышленность.</w:t>
+        <w:rPr>
+          <w:b/>
+        </w:rPr>
+        <w:t>GNoME (Google DeepMind)</w:t>
+      </w:r>
+      <w:r>
+        <w:t xml:space="preserve"> — поиск новых стабильных кристаллических структур.</w:t>
       </w:r>
     </w:p>
     <w:p>
@@ -324,7 +257,21 @@
         <w:spacing w:after="60"/>
       </w:pPr>
       <w:r>
-        <w:t>Отдельное Telegram-сообщение для каждого раздела.</w:t>
+        <w:rPr>
+          <w:b/>
+        </w:rPr>
+        <w:t>Orbital Materials</w:t>
+      </w:r>
+      <w:r>
+        <w:t xml:space="preserve"> — дизайн материалов с заданными физическими свойствами.</w:t>
+      </w:r>
+    </w:p>
+    <w:p>
+      <w:pPr>
+        <w:pStyle w:val="Heading2"/>
+      </w:pPr>
+      <w:r>
+        <w:t>Замена лаборатории / autonomous labs</w:t>
       </w:r>
     </w:p>
     <w:p>
@@ -333,20 +280,13 @@
         <w:spacing w:after="60"/>
       </w:pPr>
       <w:r>
-        <w:t>Сохранение текущей обработки YouTube, дедупликации, лимитов очереди и защиты от недоступных источников.</w:t>
+        <w:rPr>
+          <w:b/>
+        </w:rPr>
+        <w:t>A-Lab (Berkeley Lab)</w:t>
       </w:r>
-    </w:p>
-    <w:p>
-      <w:pPr>
-        <w:pStyle w:val="Heading1"/>
-      </w:pPr>
       <w:r>
-        <w:t>3. Правило классификации</w:t>
-      </w:r>
-    </w:p>
-    <w:p>
-      <w:r>
-        <w:t>Материал относится к «ИИ для изобретений», если он описывает доступный инструмент, исследовательский прототип, агента, платформу или метод, который помогает получить или проверить новое решение.</w:t>
+        <w:t xml:space="preserve"> — рецепты, роботический синтез и анализ материалов.</w:t>
       </w:r>
     </w:p>
     <w:p>
@@ -355,7 +295,26 @@
         <w:spacing w:after="60"/>
       </w:pPr>
       <w:r>
-        <w:t>спроектировать или синтезировать молекулу или лекарство;</w:t>
+        <w:rPr>
+          <w:b/>
+        </w:rPr>
+        <w:t>Orbital Materials</w:t>
+      </w:r>
+      <w:r>
+        <w:t xml:space="preserve"> — модель материаловедения для заказа материала с нужными</w:t>
+      </w:r>
+    </w:p>
+    <w:p>
+      <w:r>
+        <w:t xml:space="preserve">  свойствами и получения структуры. Это одна карточка с несколькими тегами.</w:t>
+      </w:r>
+    </w:p>
+    <w:p>
+      <w:pPr>
+        <w:pStyle w:val="Heading2"/>
+      </w:pPr>
+      <w:r>
+        <w:t>Полный цикл: США</w:t>
       </w:r>
     </w:p>
     <w:p>
@@ -364,7 +323,13 @@
         <w:spacing w:after="60"/>
       </w:pPr>
       <w:r>
-        <w:t>открыть или оптимизировать материал;</w:t>
+        <w:rPr>
+          <w:b/>
+        </w:rPr>
+        <w:t>Schrödinger Materials Science Platform</w:t>
+      </w:r>
+      <w:r>
+        <w:t xml:space="preserve"> — платно.</w:t>
       </w:r>
     </w:p>
     <w:p>
@@ -373,7 +338,13 @@
         <w:spacing w:after="60"/>
       </w:pPr>
       <w:r>
-        <w:t>спроектировать устройство, конструкцию или производственный процесс;</w:t>
+        <w:rPr>
+          <w:b/>
+        </w:rPr>
+        <w:t>IBM RXN for Chemistry</w:t>
+      </w:r>
+      <w:r>
+        <w:t xml:space="preserve"> — demo бесплатно, бизнес-доступ платный.</w:t>
       </w:r>
     </w:p>
     <w:p>
@@ -382,64 +353,13 @@
         <w:spacing w:after="60"/>
       </w:pPr>
       <w:r>
-        <w:t>провести симуляцию, экспериментальный поиск или верификацию кандидатов.</w:t>
+        <w:rPr>
+          <w:b/>
+        </w:rPr>
+        <w:t>ASKCOS (MIT)</w:t>
       </w:r>
-    </w:p>
-    <w:tbl>
-      <w:tblPr>
-        <w:tblW w:type="auto" w:w="0"/>
-        <w:jc w:val="center"/>
-        <w:tblLook w:firstColumn="1" w:firstRow="1" w:lastColumn="0" w:lastRow="0" w:noHBand="0" w:noVBand="1" w:val="04A0"/>
-      </w:tblPr>
-      <w:tblGrid>
-        <w:gridCol w:w="9792"/>
-      </w:tblGrid>
-      <w:tr>
-        <w:tc>
-          <w:tcPr>
-            <w:tcW w:type="dxa" w:w="9792"/>
-            <w:shd w:fill="EAF3F8"/>
-            <w:tcMar>
-              <w:top w:w="100" w:type="dxa"/>
-              <w:start w:w="140" w:type="dxa"/>
-              <w:bottom w:w="100" w:type="dxa"/>
-              <w:end w:w="140" w:type="dxa"/>
-            </w:tcMar>
-          </w:tcPr>
-          <w:p>
-            <w:pPr>
-              <w:spacing w:after="0"/>
-            </w:pPr>
-            <w:r>
-              <w:rPr>
-                <w:b/>
-                <w:color w:val="1F4D78"/>
-              </w:rPr>
-              <w:t xml:space="preserve">ГРАНИЦА РАЗДЕЛОВ  </w:t>
-            </w:r>
-            <w:r>
-              <w:t>Материалы только о чтении статей, поиске литературы, суммаризации и общем анализе научных данных остаются в «ИИ для науки», если нет явной функции создания или проверки нового решения.</w:t>
-            </w:r>
-          </w:p>
-        </w:tc>
-      </w:tr>
-    </w:tbl>
-    <w:p>
-      <w:pPr>
-        <w:spacing w:after="0"/>
-      </w:pPr>
-    </w:p>
-    <w:p>
-      <w:pPr>
-        <w:pStyle w:val="Heading1"/>
-      </w:pPr>
       <w:r>
-        <w:t>4. Источники для проверки</w:t>
-      </w:r>
-    </w:p>
-    <w:p>
-      <w:r>
-        <w:t>Финальный список будет проверен перед реализацией на доступность RSS/API/HTML, стабильность, качество и дедупликацию.</w:t>
+        <w:t xml:space="preserve"> — open source.</w:t>
       </w:r>
     </w:p>
     <w:p>
@@ -448,7 +368,13 @@
         <w:spacing w:after="60"/>
       </w:pPr>
       <w:r>
-        <w:t>Google DeepMind / AlphaFold и scientific discovery</w:t>
+        <w:rPr>
+          <w:b/>
+        </w:rPr>
+        <w:t>Citrine Platform</w:t>
+      </w:r>
+      <w:r>
+        <w:t xml:space="preserve"> — платно, материалы и способы производства.</w:t>
       </w:r>
     </w:p>
     <w:p>
@@ -457,7 +383,21 @@
         <w:spacing w:after="60"/>
       </w:pPr>
       <w:r>
-        <w:t>Microsoft Research AI for Science</w:t>
+        <w:rPr>
+          <w:b/>
+        </w:rPr>
+        <w:t>Synple Chem</w:t>
+      </w:r>
+      <w:r>
+        <w:t xml:space="preserve"> — платно, ПО и оборудование для автоматизированного синтеза.</w:t>
+      </w:r>
+    </w:p>
+    <w:p>
+      <w:pPr>
+        <w:pStyle w:val="Heading2"/>
+      </w:pPr>
+      <w:r>
+        <w:t>Полный цикл: Китай</w:t>
       </w:r>
     </w:p>
     <w:p>
@@ -466,7 +406,18 @@
         <w:spacing w:after="60"/>
       </w:pPr>
       <w:r>
-        <w:t>NVIDIA BioNeMo</w:t>
+        <w:rPr>
+          <w:b/>
+        </w:rPr>
+        <w:t>Deep-Molecular (DeepPotential / DP Technology)</w:t>
+      </w:r>
+      <w:r>
+        <w:t xml:space="preserve"> — молекулярная динамика и</w:t>
+      </w:r>
+    </w:p>
+    <w:p>
+      <w:r>
+        <w:t xml:space="preserve">  AI-дизайн материалов.</w:t>
       </w:r>
     </w:p>
     <w:p>
@@ -475,7 +426,13 @@
         <w:spacing w:after="60"/>
       </w:pPr>
       <w:r>
-        <w:t>IBM Research: materials discovery и AI for science</w:t>
+        <w:rPr>
+          <w:b/>
+        </w:rPr>
+        <w:t>Baidu PaddleHelix</w:t>
+      </w:r>
+      <w:r>
+        <w:t xml:space="preserve"> — open source-компоненты и enterprise-возможности.</w:t>
       </w:r>
     </w:p>
     <w:p>
@@ -484,7 +441,18 @@
         <w:spacing w:after="60"/>
       </w:pPr>
       <w:r>
-        <w:t>Nature / npj Computational Materials / Nature Machine Intelligence</w:t>
+        <w:rPr>
+          <w:b/>
+        </w:rPr>
+        <w:t>ChemAI (Shanghai Institute of Organic Chemistry)</w:t>
+      </w:r>
+      <w:r>
+        <w:t xml:space="preserve"> — база реакций и</w:t>
+      </w:r>
+    </w:p>
+    <w:p>
+      <w:r>
+        <w:t xml:space="preserve">  ретросинтез.</w:t>
       </w:r>
     </w:p>
     <w:p>
@@ -493,7 +461,41 @@
         <w:spacing w:after="60"/>
       </w:pPr>
       <w:r>
-        <w:t>ACS Publications / Chemical &amp; Engineering News</w:t>
+        <w:rPr>
+          <w:b/>
+        </w:rPr>
+        <w:t>Galactica: китайские форки и доработки</w:t>
+      </w:r>
+      <w:r>
+        <w:t xml:space="preserve"> — open source-ориентированные</w:t>
+      </w:r>
+    </w:p>
+    <w:p>
+      <w:r>
+        <w:t xml:space="preserve">  варианты для химического синтеза.</w:t>
+      </w:r>
+    </w:p>
+    <w:p>
+      <w:r>
+        <w:t>Статусы доступа и описания проверяются по официальным страницам перед</w:t>
+      </w:r>
+    </w:p>
+    <w:p>
+      <w:r>
+        <w:t>публикацией. Неподтверждённые свойства не выдаются за факт.</w:t>
+      </w:r>
+    </w:p>
+    <w:p>
+      <w:pPr>
+        <w:pStyle w:val="Heading1"/>
+      </w:pPr>
+      <w:r>
+        <w:t>4. Формат карточки инструмента</w:t>
+      </w:r>
+    </w:p>
+    <w:p>
+      <w:r>
+        <w:t>Каждая постоянная карточка содержит:</w:t>
       </w:r>
     </w:p>
     <w:p>
@@ -502,7 +504,7 @@
         <w:spacing w:after="60"/>
       </w:pPr>
       <w:r>
-        <w:t>Materials Project и Berkeley Lab</w:t>
+        <w:t>название;</w:t>
       </w:r>
     </w:p>
     <w:p>
@@ -511,7 +513,7 @@
         <w:spacing w:after="60"/>
       </w:pPr>
       <w:r>
-        <w:t>arXiv: physics.chem-ph, cond-mat.mtrl-sci, q-bio.BM, cs.ET</w:t>
+        <w:t>разработчика или организацию;</w:t>
       </w:r>
     </w:p>
     <w:p>
@@ -520,12 +522,70 @@
         <w:spacing w:after="60"/>
       </w:pPr>
       <w:r>
-        <w:t>Официальные блоги инструментов лабораторной автоматизации и autonomous labs</w:t>
+        <w:t>страну;</w:t>
       </w:r>
     </w:p>
     <w:p>
+      <w:pPr>
+        <w:pStyle w:val="ListBullet"/>
+        <w:spacing w:after="60"/>
+      </w:pPr>
       <w:r>
-        <w:t>Источники, заблокированные дата-центром или не имеющие стабильного fallback, подключаться не будут.</w:t>
+        <w:t>направление/тип инструмента;</w:t>
+      </w:r>
+    </w:p>
+    <w:p>
+      <w:pPr>
+        <w:pStyle w:val="ListBullet"/>
+        <w:spacing w:after="60"/>
+      </w:pPr>
+      <w:r>
+        <w:t>один или несколько тегов сфер;</w:t>
+      </w:r>
+    </w:p>
+    <w:p>
+      <w:pPr>
+        <w:pStyle w:val="ListBullet"/>
+        <w:spacing w:after="60"/>
+      </w:pPr>
+      <w:r>
+        <w:t>статус доступа: бесплатно, open source, demo или платно;</w:t>
+      </w:r>
+    </w:p>
+    <w:p>
+      <w:pPr>
+        <w:pStyle w:val="ListBullet"/>
+        <w:spacing w:after="60"/>
+      </w:pPr>
+      <w:r>
+        <w:t>краткое описание;</w:t>
+      </w:r>
+    </w:p>
+    <w:p>
+      <w:pPr>
+        <w:pStyle w:val="ListBullet"/>
+        <w:spacing w:after="60"/>
+      </w:pPr>
+      <w:r>
+        <w:t>официальный сайт;</w:t>
+      </w:r>
+    </w:p>
+    <w:p>
+      <w:pPr>
+        <w:pStyle w:val="ListBullet"/>
+        <w:spacing w:after="60"/>
+      </w:pPr>
+      <w:r>
+        <w:t>документацию или GitHub, если доступно;</w:t>
+      </w:r>
+    </w:p>
+    <w:p>
+      <w:pPr>
+        <w:pStyle w:val="ListBullet"/>
+        <w:spacing w:after="60"/>
+      </w:pPr>
+      <w:r>
+        <w:t>дату последней проверки.</w:t>
       </w:r>
     </w:p>
     <w:p>
@@ -533,181 +593,87 @@
         <w:pStyle w:val="Heading1"/>
       </w:pPr>
       <w:r>
-        <w:t>5. Telegram</w:t>
+        <w:t>5. Поиск и дедупликация</w:t>
       </w:r>
     </w:p>
     <w:p>
       <w:r>
-        <w:t>Один существующий бот будет отправлять три отдельных сообщения:</w:t>
+        <w:t>Субагенты используют общий поток, обязательный список инструментов и источники</w:t>
       </w:r>
     </w:p>
-    <w:tbl>
-      <w:tblPr>
-        <w:tblW w:type="auto" w:w="0"/>
-        <w:jc w:val="left"/>
-        <w:tblLayout w:type="fixed"/>
-        <w:tblLook w:firstColumn="1" w:firstRow="1" w:lastColumn="0" w:lastRow="0" w:noHBand="0" w:noVBand="1" w:val="04A0"/>
-      </w:tblPr>
-      <w:tblGrid>
-        <w:gridCol w:w="4896"/>
-        <w:gridCol w:w="4896"/>
-      </w:tblGrid>
-      <w:tr>
-        <w:tc>
-          <w:tcPr>
-            <w:tcW w:type="dxa" w:w="4896"/>
-            <w:shd w:fill="E8EEF5"/>
-            <w:tcMar>
-              <w:top w:w="100" w:type="dxa"/>
-              <w:start w:w="140" w:type="dxa"/>
-              <w:bottom w:w="100" w:type="dxa"/>
-              <w:end w:w="140" w:type="dxa"/>
-            </w:tcMar>
-          </w:tcPr>
-          <w:p>
-            <w:pPr>
-              <w:spacing w:after="0"/>
-            </w:pPr>
-            <w:r>
-              <w:rPr>
-                <w:b/>
-                <w:color w:val="1F4D78"/>
-              </w:rPr>
-              <w:t>Сообщение</w:t>
-            </w:r>
-          </w:p>
-        </w:tc>
-        <w:tc>
-          <w:tcPr>
-            <w:tcW w:type="dxa" w:w="4896"/>
-            <w:shd w:fill="E8EEF5"/>
-            <w:tcMar>
-              <w:top w:w="100" w:type="dxa"/>
-              <w:start w:w="140" w:type="dxa"/>
-              <w:bottom w:w="100" w:type="dxa"/>
-              <w:end w:w="140" w:type="dxa"/>
-            </w:tcMar>
-          </w:tcPr>
-          <w:p>
-            <w:pPr>
-              <w:spacing w:after="0"/>
-            </w:pPr>
-            <w:r>
-              <w:rPr>
-                <w:b/>
-                <w:color w:val="1F4D78"/>
-              </w:rPr>
-              <w:t>Содержание</w:t>
-            </w:r>
-          </w:p>
-        </w:tc>
-      </w:tr>
-      <w:tr>
-        <w:tc>
-          <w:tcPr>
-            <w:tcW w:type="dxa" w:w="4896"/>
-            <w:tcMar>
-              <w:top w:w="100" w:type="dxa"/>
-              <w:start w:w="140" w:type="dxa"/>
-              <w:bottom w:w="100" w:type="dxa"/>
-              <w:end w:w="140" w:type="dxa"/>
-            </w:tcMar>
-          </w:tcPr>
-          <w:p>
-            <w:r>
-              <w:t>🔬 ИИ для науки</w:t>
-            </w:r>
-          </w:p>
-        </w:tc>
-        <w:tc>
-          <w:tcPr>
-            <w:tcW w:type="dxa" w:w="4896"/>
-            <w:tcMar>
-              <w:top w:w="100" w:type="dxa"/>
-              <w:start w:w="140" w:type="dxa"/>
-              <w:bottom w:w="100" w:type="dxa"/>
-              <w:end w:w="140" w:type="dxa"/>
-            </w:tcMar>
-          </w:tcPr>
-          <w:p>
-            <w:r>
-              <w:t>Карточки научных инструментов и материалы с тегами сфер</w:t>
-            </w:r>
-          </w:p>
-        </w:tc>
-      </w:tr>
-      <w:tr>
-        <w:tc>
-          <w:tcPr>
-            <w:tcW w:type="dxa" w:w="4896"/>
-            <w:tcMar>
-              <w:top w:w="100" w:type="dxa"/>
-              <w:start w:w="140" w:type="dxa"/>
-              <w:bottom w:w="100" w:type="dxa"/>
-              <w:end w:w="140" w:type="dxa"/>
-            </w:tcMar>
-          </w:tcPr>
-          <w:p>
-            <w:r>
-              <w:t>🛠 ИИ-инструменты</w:t>
-            </w:r>
-          </w:p>
-        </w:tc>
-        <w:tc>
-          <w:tcPr>
-            <w:tcW w:type="dxa" w:w="4896"/>
-            <w:tcMar>
-              <w:top w:w="100" w:type="dxa"/>
-              <w:start w:w="140" w:type="dxa"/>
-              <w:bottom w:w="100" w:type="dxa"/>
-              <w:end w:w="140" w:type="dxa"/>
-            </w:tcMar>
-          </w:tcPr>
-          <w:p>
-            <w:r>
-              <w:t>Текущая подборка AI-инструментов</w:t>
-            </w:r>
-          </w:p>
-        </w:tc>
-      </w:tr>
-      <w:tr>
-        <w:tc>
-          <w:tcPr>
-            <w:tcW w:type="dxa" w:w="4896"/>
-            <w:tcMar>
-              <w:top w:w="100" w:type="dxa"/>
-              <w:start w:w="140" w:type="dxa"/>
-              <w:bottom w:w="100" w:type="dxa"/>
-              <w:end w:w="140" w:type="dxa"/>
-            </w:tcMar>
-          </w:tcPr>
-          <w:p>
-            <w:r>
-              <w:t>🧪 ИИ для изобретений</w:t>
-            </w:r>
-          </w:p>
-        </w:tc>
-        <w:tc>
-          <w:tcPr>
-            <w:tcW w:type="dxa" w:w="4896"/>
-            <w:tcMar>
-              <w:top w:w="100" w:type="dxa"/>
-              <w:start w:w="140" w:type="dxa"/>
-              <w:bottom w:w="100" w:type="dxa"/>
-              <w:end w:w="140" w:type="dxa"/>
-            </w:tcMar>
-          </w:tcPr>
-          <w:p>
-            <w:r>
-              <w:t>Инструменты, агенты и методы для создания/проверки новых решений</w:t>
-            </w:r>
-          </w:p>
-        </w:tc>
-      </w:tr>
-    </w:tbl>
     <w:p>
       <w:r>
-        <w:t>В каждой карточке отображаются один или несколько тегов сфер, например: «Химия · Материалы · Фармацевтика». Действующие два получателя сохраняются.</w:t>
+        <w:t>из других отраслей. Приоритетные сферы: химия, материалы, биология, медицина,</w:t>
+      </w:r>
+    </w:p>
+    <w:p>
+      <w:r>
+        <w:t>фармацевтика, инженерия, энергетика, робототехника, климат/экология и</w:t>
+      </w:r>
+    </w:p>
+    <w:p>
+      <w:r>
+        <w:t>промышленность.</w:t>
+      </w:r>
+    </w:p>
+    <w:p>
+      <w:r>
+        <w:t>Дедупликация должна различать:</w:t>
+      </w:r>
+    </w:p>
+    <w:p>
+      <w:pPr>
+        <w:pStyle w:val="ListBullet"/>
+        <w:spacing w:after="60"/>
+      </w:pPr>
+      <w:r>
+        <w:t>повтор той же публикации или URL — отбрасывается;</w:t>
+      </w:r>
+    </w:p>
+    <w:p>
+      <w:pPr>
+        <w:pStyle w:val="ListBullet"/>
+        <w:spacing w:after="60"/>
+      </w:pPr>
+      <w:r>
+        <w:t>новую публикацию об уже известном инструменте — допускается;</w:t>
+      </w:r>
+    </w:p>
+    <w:p>
+      <w:pPr>
+        <w:pStyle w:val="ListBullet"/>
+        <w:spacing w:after="60"/>
+      </w:pPr>
+      <w:r>
+        <w:t>новый релиз/версию, исследование, результат или применение инструмента — это</w:t>
+      </w:r>
+    </w:p>
+    <w:p>
+      <w:r>
+        <w:t xml:space="preserve">  отдельная новость;</w:t>
+      </w:r>
+    </w:p>
+    <w:p>
+      <w:pPr>
+        <w:pStyle w:val="ListBullet"/>
+        <w:spacing w:after="60"/>
+      </w:pPr>
+      <w:r>
+        <w:t>постоянную карточку инструмента и новости о нём — это разные сущности;</w:t>
+      </w:r>
+    </w:p>
+    <w:p>
+      <w:pPr>
+        <w:pStyle w:val="ListBullet"/>
+        <w:spacing w:after="60"/>
+      </w:pPr>
+      <w:r>
+        <w:t>пересечение разделов — один основной раздел плюс дополнительные теги, без</w:t>
+      </w:r>
+    </w:p>
+    <w:p>
+      <w:r>
+        <w:t xml:space="preserve">  повторной публикации одной карточки.</w:t>
       </w:r>
     </w:p>
     <w:p>
@@ -715,7 +681,173 @@
         <w:pStyle w:val="Heading1"/>
       </w:pPr>
       <w:r>
-        <w:t>6. Не входит в MVP</w:t>
+        <w:t>6. Источники для проверки</w:t>
+      </w:r>
+    </w:p>
+    <w:p>
+      <w:r>
+        <w:t>Кандидаты: Google DeepMind/AlphaFold, Microsoft Research AI for Science,</w:t>
+      </w:r>
+    </w:p>
+    <w:p>
+      <w:r>
+        <w:t>NVIDIA BioNeMo, IBM Research, Nature/npj Computational Materials, Nature Machine</w:t>
+      </w:r>
+    </w:p>
+    <w:p>
+      <w:r>
+        <w:t>Intelligence, ACS Publications, Chemical &amp; Engineering News, Materials Project,</w:t>
+      </w:r>
+    </w:p>
+    <w:p>
+      <w:r>
+        <w:t xml:space="preserve">Berkeley Lab, arXiv </w:t>
+      </w:r>
+      <w:r>
+        <w:rPr>
+          <w:rFonts w:ascii="Aptos Mono" w:hAnsi="Aptos Mono"/>
+          <w:sz w:val="19"/>
+        </w:rPr>
+        <w:t>physics.chem-ph</w:t>
+      </w:r>
+      <w:r>
+        <w:t xml:space="preserve">, </w:t>
+      </w:r>
+      <w:r>
+        <w:rPr>
+          <w:rFonts w:ascii="Aptos Mono" w:hAnsi="Aptos Mono"/>
+          <w:sz w:val="19"/>
+        </w:rPr>
+        <w:t>cond-mat.mtrl-sci</w:t>
+      </w:r>
+      <w:r>
+        <w:t xml:space="preserve">, </w:t>
+      </w:r>
+      <w:r>
+        <w:rPr>
+          <w:rFonts w:ascii="Aptos Mono" w:hAnsi="Aptos Mono"/>
+          <w:sz w:val="19"/>
+        </w:rPr>
+        <w:t>q-bio.BM</w:t>
+      </w:r>
+      <w:r>
+        <w:t xml:space="preserve">, </w:t>
+      </w:r>
+      <w:r>
+        <w:rPr>
+          <w:rFonts w:ascii="Aptos Mono" w:hAnsi="Aptos Mono"/>
+          <w:sz w:val="19"/>
+        </w:rPr>
+        <w:t>cs.ET</w:t>
+      </w:r>
+      <w:r>
+        <w:t>,</w:t>
+      </w:r>
+    </w:p>
+    <w:p>
+      <w:r>
+        <w:t>блоги лабораторной автоматизации и autonomous labs.</w:t>
+      </w:r>
+    </w:p>
+    <w:p>
+      <w:r>
+        <w:t>Перед подключением источник проверяется на стабильность RSS/API/HTML, качество,</w:t>
+      </w:r>
+    </w:p>
+    <w:p>
+      <w:r>
+        <w:t>доступность из дата-центра и дедупликацию. ScrapeGraphAI используется как</w:t>
+      </w:r>
+    </w:p>
+    <w:p>
+      <w:r>
+        <w:t>fallback, а не для обхода запретов автоматизированного доступа.</w:t>
+      </w:r>
+    </w:p>
+    <w:p>
+      <w:pPr>
+        <w:pStyle w:val="Heading1"/>
+      </w:pPr>
+      <w:r>
+        <w:t>7. Telegram</w:t>
+      </w:r>
+    </w:p>
+    <w:p>
+      <w:r>
+        <w:t>Один существующий бот отправляет три отдельных сообщения:</w:t>
+      </w:r>
+    </w:p>
+    <w:p>
+      <w:pPr>
+        <w:pStyle w:val="ListNumber"/>
+        <w:spacing w:after="60"/>
+      </w:pPr>
+      <w:r>
+        <w:rPr>
+          <w:rFonts w:ascii="Aptos Mono" w:hAnsi="Aptos Mono"/>
+          <w:sz w:val="19"/>
+        </w:rPr>
+        <w:t>ИИ-новости</w:t>
+      </w:r>
+      <w:r>
+        <w:t>;</w:t>
+      </w:r>
+    </w:p>
+    <w:p>
+      <w:pPr>
+        <w:pStyle w:val="ListNumber"/>
+        <w:spacing w:after="60"/>
+      </w:pPr>
+      <w:r>
+        <w:rPr>
+          <w:rFonts w:ascii="Aptos Mono" w:hAnsi="Aptos Mono"/>
+          <w:sz w:val="19"/>
+        </w:rPr>
+        <w:t>ИИ для науки</w:t>
+      </w:r>
+      <w:r>
+        <w:t>;</w:t>
+      </w:r>
+    </w:p>
+    <w:p>
+      <w:pPr>
+        <w:pStyle w:val="ListNumber"/>
+        <w:spacing w:after="60"/>
+      </w:pPr>
+      <w:r>
+        <w:rPr>
+          <w:rFonts w:ascii="Aptos Mono" w:hAnsi="Aptos Mono"/>
+          <w:sz w:val="19"/>
+        </w:rPr>
+        <w:t>Инструменты для изобретений</w:t>
+      </w:r>
+      <w:r>
+        <w:t>.</w:t>
+      </w:r>
+    </w:p>
+    <w:p>
+      <w:r>
+        <w:t>В каждой карточке указываются один или несколько тегов сфер, например:</w:t>
+      </w:r>
+    </w:p>
+    <w:p>
+      <w:r>
+        <w:rPr>
+          <w:rFonts w:ascii="Aptos Mono" w:hAnsi="Aptos Mono"/>
+          <w:sz w:val="19"/>
+        </w:rPr>
+        <w:t>Химия · Материалы · Фармацевтика</w:t>
+      </w:r>
+      <w:r>
+        <w:t>. Действующие два получателя сохраняются.</w:t>
+      </w:r>
+    </w:p>
+    <w:p>
+      <w:pPr>
+        <w:pStyle w:val="Heading1"/>
+      </w:pPr>
+      <w:r>
+        <w:t>8. Не входит в MVP</w:t>
       </w:r>
     </w:p>
     <w:p>
@@ -733,7 +865,7 @@
         <w:spacing w:after="60"/>
       </w:pPr>
       <w:r>
-        <w:t>ручная админ-панель для исправления классификации;</w:t>
+        <w:t>ручная админ-панель исправления классификации;</w:t>
       </w:r>
     </w:p>
     <w:p>
@@ -742,16 +874,7 @@
         <w:spacing w:after="60"/>
       </w:pPr>
       <w:r>
-        <w:t>автоматическое редактирование уже опубликованных старых карточек;</w:t>
-      </w:r>
-    </w:p>
-    <w:p>
-      <w:pPr>
-        <w:pStyle w:val="ListBullet"/>
-        <w:spacing w:after="60"/>
-      </w:pPr>
-      <w:r>
-        <w:t>гарантированное покрытие всех научных источников мира;</w:t>
+        <w:t>автоматическое редактирование старых карточек;</w:t>
       </w:r>
     </w:p>
     <w:p>
@@ -769,7 +892,7 @@
         <w:spacing w:after="60"/>
       </w:pPr>
       <w:r>
-        <w:t>изменение текущей модели суммаризации без отдельной необходимости.</w:t>
+        <w:t>изменение модели суммаризации без отдельной необходимости.</w:t>
       </w:r>
     </w:p>
     <w:p>
@@ -777,7 +900,7 @@
         <w:pStyle w:val="Heading1"/>
       </w:pPr>
       <w:r>
-        <w:t>7. Критерии приёмки</w:t>
+        <w:t>9. Критерии приёмки</w:t>
       </w:r>
     </w:p>
     <w:p>
@@ -786,7 +909,7 @@
         <w:spacing w:after="60"/>
       </w:pPr>
       <w:r>
-        <w:t>Материал о создании, синтезе или проектировании нового решения попадает в новый раздел и сохраняет исходную карточку.</w:t>
+        <w:t>На сайте отображаются три согласованных раздела.</w:t>
       </w:r>
     </w:p>
     <w:p>
@@ -795,7 +918,12 @@
         <w:spacing w:after="60"/>
       </w:pPr>
       <w:r>
-        <w:t>Материал только о научном поиске не попадает в новый раздел без признаков изобретательской функции.</w:t>
+        <w:t>Все обязательные инструменты представлены постоянными карточками с описанием</w:t>
+      </w:r>
+    </w:p>
+    <w:p>
+      <w:r>
+        <w:t xml:space="preserve">  и ссылками.</w:t>
       </w:r>
     </w:p>
     <w:p>
@@ -804,7 +932,12 @@
         <w:spacing w:after="60"/>
       </w:pPr>
       <w:r>
-        <w:t>Одна карточка может иметь несколько сфер.</w:t>
+        <w:t>Новость об обновлении известного инструмента не блокируется его карточкой или</w:t>
+      </w:r>
+    </w:p>
+    <w:p>
+      <w:r>
+        <w:t xml:space="preserve">  предыдущей новостью.</w:t>
       </w:r>
     </w:p>
     <w:p>
@@ -813,7 +946,7 @@
         <w:spacing w:after="60"/>
       </w:pPr>
       <w:r>
-        <w:t>В дашборде доступны три раздела и фильтр нового раздела.</w:t>
+        <w:t>Повтор той же публикации не появляется повторно.</w:t>
       </w:r>
     </w:p>
     <w:p>
@@ -822,7 +955,7 @@
         <w:spacing w:after="60"/>
       </w:pPr>
       <w:r>
-        <w:t>Telegram отправляет отдельные сообщения по разделам, а карточки содержат теги сфер.</w:t>
+        <w:t>У карточки может быть несколько сфер.</w:t>
       </w:r>
     </w:p>
     <w:p>
@@ -831,7 +964,7 @@
         <w:spacing w:after="60"/>
       </w:pPr>
       <w:r>
-        <w:t>Дубликаты не появляются одновременно в нескольких разделах без причины.</w:t>
+        <w:t>Telegram отправляет три отдельных сообщения с теми же названиями и тегами.</w:t>
       </w:r>
     </w:p>
     <w:p>
@@ -840,33 +973,7 @@
         <w:spacing w:after="60"/>
       </w:pPr>
       <w:r>
-        <w:t>Существующий сбор, YouTube transcript-first и публикация не ломаются.</w:t>
-      </w:r>
-    </w:p>
-    <w:p>
-      <w:pPr>
-        <w:pStyle w:val="Heading1"/>
-      </w:pPr>
-      <w:r>
-        <w:t>8. Предварительная оценка</w:t>
-      </w:r>
-    </w:p>
-    <w:p>
-      <w:r>
-        <w:t>Рекомендуемая цена MVP: 12 000–16 000 ₽.</w:t>
-      </w:r>
-    </w:p>
-    <w:p>
-      <w:r>
-        <w:t>Оценка учитывает трёхагентную маршрутизацию, специализированный поиск, изменение схемы карточек и фильтров, а также новый Telegram-формат. Точная сумма фиксируется после подтверждения источников и поведения пустых разделов.</w:t>
-      </w:r>
-    </w:p>
-    <w:p>
-      <w:pPr>
-        <w:pStyle w:val="Heading1"/>
-      </w:pPr>
-      <w:r>
-        <w:t>9. Решения перед реализацией</w:t>
+        <w:t>ScrapeGraphAI работает как fallback и не ломает RSS/API-поток.</w:t>
       </w:r>
     </w:p>
     <w:p>
@@ -875,47 +982,54 @@
         <w:spacing w:after="60"/>
       </w:pPr>
       <w:r>
-        <w:t>Утвердить диапазон стоимости.</w:t>
+        <w:t>YouTube transcript-first, SSRF-защита, дедупликация и публикация сохраняются.</w:t>
       </w:r>
     </w:p>
     <w:p>
       <w:pPr>
-        <w:pStyle w:val="ListBullet"/>
-        <w:spacing w:after="60"/>
+        <w:pStyle w:val="Heading1"/>
       </w:pPr>
       <w:r>
-        <w:t>Утвердить список специализированных источников после технической проверки.</w:t>
+        <w:t>10. Оценка</w:t>
       </w:r>
     </w:p>
     <w:p>
-      <w:pPr>
-        <w:pStyle w:val="ListBullet"/>
-        <w:spacing w:after="60"/>
-      </w:pPr>
       <w:r>
-        <w:t>Решить: не отправлять пустой раздел или отправлять сообщение «новых материалов нет».</w:t>
+        <w:t xml:space="preserve">Рекомендуемая цена обновлённого MVP: </w:t>
+      </w:r>
+      <w:r>
+        <w:rPr>
+          <w:b/>
+        </w:rPr>
+        <w:t>16 000–22 000 ₽</w:t>
+      </w:r>
+      <w:r>
+        <w:t>. Диапазон учитывает</w:t>
       </w:r>
     </w:p>
     <w:p>
-      <w:pPr>
-        <w:pStyle w:val="ListBullet"/>
-        <w:spacing w:after="60"/>
-      </w:pPr>
       <w:r>
-        <w:t>Подтвердить отправку отдельных сообщений обоим текущим получателям.</w:t>
+        <w:t>постоянный каталог, три субагента, новый fallback-скрейпер, обновлённую</w:t>
       </w:r>
     </w:p>
     <w:p>
-      <w:pPr>
-        <w:jc w:val="center"/>
-      </w:pPr>
       <w:r>
-        <w:rPr>
-          <w:i/>
-          <w:color w:val="6E7D8C"/>
-          <w:sz w:val="18"/>
-        </w:rPr>
-        <w:t>Документ подготовлен для согласования объёма работ с клиентом.</w:t>
+        <w:t>дедупликацию и три Telegram-сообщения.</w:t>
+      </w:r>
+    </w:p>
+    <w:p>
+      <w:r>
+        <w:t>Перед реализацией клиент утверждает финальные ссылки карточек после проверки,</w:t>
+      </w:r>
+    </w:p>
+    <w:p>
+      <w:r>
+        <w:t>поведение пустых разделов, отправку сообщений обоим получателям и диапазон</w:t>
+      </w:r>
+    </w:p>
+    <w:p>
+      <w:r>
+        <w:t>стоимости.</w:t>
       </w:r>
     </w:p>
     <w:sectPr>
@@ -942,7 +1056,7 @@
         <w:color w:val="78828C"/>
         <w:sz w:val="16"/>
       </w:rPr>
-      <w:t>ИИ для изобретений  |  13 августа 2026 г.</w:t>
+      <w:t>Инструменты для изобретений  |  14 августа 2026 г.</w:t>
     </w:r>
   </w:p>
 </w:ftr>
@@ -1393,7 +1507,7 @@
     <w:pPr>
       <w:keepNext/>
       <w:keepLines/>
-      <w:spacing w:before="300" w:after="140"/>
+      <w:spacing w:before="280" w:after="120"/>
       <w:outlineLvl w:val="0"/>
     </w:pPr>
     <w:rPr>
@@ -1417,7 +1531,7 @@
     <w:pPr>
       <w:keepNext/>
       <w:keepLines/>
-      <w:spacing w:before="220" w:after="100"/>
+      <w:spacing w:before="280" w:after="120"/>
       <w:outlineLvl w:val="1"/>
     </w:pPr>
     <w:rPr>

</xml_diff>